<commit_message>
Update desktop pet performance evaluation docs
</commit_message>
<xml_diff>
--- a/桌宠类产品性能测试完整步骤.docx
+++ b/桌宠类产品性能测试完整步骤.docx
@@ -360,7 +360,7 @@
               <w:spacing w:after="0"/>
             </w:pPr>
             <w:r>
-              <w:t>例如 BongoCat、Desktop Mate、VPet-Simulator、Open LLM Vtuber。</w:t>
+              <w:t>例如 BongoCat、Desktop Mate、VPet-Simulator。</w:t>
             </w:r>
           </w:p>
         </w:tc>
@@ -398,11 +398,8 @@
             </w:tcBorders>
           </w:tcPr>
           <w:p>
-            <w:pPr>
-              <w:spacing w:after="0"/>
-            </w:pPr>
             <w:r>
-              <w:t>Steam / GitHub Release / GitHub Source / 官网 / 自研。</w:t>
+              <w:t>Steam / itch.io / GitHub Release / GitHub Source / 官网 / 自研。本轮正式测试口径：除 Desktop Goose 来自 itch.io 外，其余产品均按 Steam 安装记录。</w:t>
             </w:r>
           </w:p>
         </w:tc>
@@ -482,11 +479,8 @@
             </w:tcBorders>
           </w:tcPr>
           <w:p>
-            <w:pPr>
-              <w:spacing w:after="0"/>
-            </w:pPr>
             <w:r>
-              <w:t>exe 直接运行、Steam 启动、Python/Node/Electron 源码运行、Unity build 等。</w:t>
+              <w:t>Steam 启动、itch.io 安装包/exe 直接运行、GitHub Release exe 直接运行、Python/Node/Electron 源码运行、Unity build 等。</w:t>
             </w:r>
           </w:p>
         </w:tc>
@@ -3772,10 +3766,22 @@
           <w:sz w:val="17"/>
         </w:rPr>
         <w:t>powershell -ExecutionPolicy Bypass -File D:\desktop_pet\tools\collect_desktop_pet_perf.ps1 `</w:t>
+        <w:br/>
+        <w:t xml:space="preserve">  -ProductId PX01 `</w:t>
+        <w:br/>
+        <w:t xml:space="preserve">  -ProductName 其他同类产品 `</w:t>
+        <w:br/>
+        <w:t xml:space="preserve">  -ProcessName python,node,其他同类产品 `</w:t>
+        <w:br/>
+        <w:t xml:space="preserve">  -Scenario 功能开启 `</w:t>
+        <w:br/>
+        <w:t xml:space="preserve">  -DurationSec 600 `</w:t>
+        <w:br/>
+        <w:t xml:space="preserve">  -IntervalSec 1 `</w:t>
+        <w:br/>
+        <w:t xml:space="preserve">  -Notes "源码运行；包含 Python/Node 子进程"</w:t>
       </w:r>
-      <w:r>
-        <w:br/>
-      </w:r>
+      <w:r/>
       <w:r>
         <w:rPr>
           <w:rFonts w:ascii="Consolas" w:hAnsi="Consolas" w:eastAsia="Consolas"/>
@@ -3783,11 +3789,8 @@
           <w:color w:val="333333"/>
           <w:sz w:val="17"/>
         </w:rPr>
-        <w:t xml:space="preserve">  -ProductId P002 `</w:t>
       </w:r>
-      <w:r>
-        <w:br/>
-      </w:r>
+      <w:r/>
       <w:r>
         <w:rPr>
           <w:rFonts w:ascii="Consolas" w:hAnsi="Consolas" w:eastAsia="Consolas"/>
@@ -3795,11 +3798,8 @@
           <w:color w:val="333333"/>
           <w:sz w:val="17"/>
         </w:rPr>
-        <w:t xml:space="preserve">  -ProductName OpenLLMVtuber `</w:t>
       </w:r>
-      <w:r>
-        <w:br/>
-      </w:r>
+      <w:r/>
       <w:r>
         <w:rPr>
           <w:rFonts w:ascii="Consolas" w:hAnsi="Consolas" w:eastAsia="Consolas"/>
@@ -3807,11 +3807,8 @@
           <w:color w:val="333333"/>
           <w:sz w:val="17"/>
         </w:rPr>
-        <w:t xml:space="preserve">  -ProcessName python,node,OpenLLMVtuber `</w:t>
       </w:r>
-      <w:r>
-        <w:br/>
-      </w:r>
+      <w:r/>
       <w:r>
         <w:rPr>
           <w:rFonts w:ascii="Consolas" w:hAnsi="Consolas" w:eastAsia="Consolas"/>
@@ -3819,11 +3816,8 @@
           <w:color w:val="333333"/>
           <w:sz w:val="17"/>
         </w:rPr>
-        <w:t xml:space="preserve">  -Scenario 功能开启 `</w:t>
       </w:r>
-      <w:r>
-        <w:br/>
-      </w:r>
+      <w:r/>
       <w:r>
         <w:rPr>
           <w:rFonts w:ascii="Consolas" w:hAnsi="Consolas" w:eastAsia="Consolas"/>
@@ -3831,11 +3825,8 @@
           <w:color w:val="333333"/>
           <w:sz w:val="17"/>
         </w:rPr>
-        <w:t xml:space="preserve">  -DurationSec 600 `</w:t>
       </w:r>
-      <w:r>
-        <w:br/>
-      </w:r>
+      <w:r/>
       <w:r>
         <w:rPr>
           <w:rFonts w:ascii="Consolas" w:hAnsi="Consolas" w:eastAsia="Consolas"/>
@@ -3843,11 +3834,8 @@
           <w:color w:val="333333"/>
           <w:sz w:val="17"/>
         </w:rPr>
-        <w:t xml:space="preserve">  -IntervalSec 1 `</w:t>
       </w:r>
-      <w:r>
-        <w:br/>
-      </w:r>
+      <w:r/>
       <w:r>
         <w:rPr>
           <w:rFonts w:ascii="Consolas" w:hAnsi="Consolas" w:eastAsia="Consolas"/>
@@ -3855,7 +3843,6 @@
           <w:color w:val="333333"/>
           <w:sz w:val="17"/>
         </w:rPr>
-        <w:t xml:space="preserve">  -Notes "源码运行；包含 Python/Node 子进程"</w:t>
       </w:r>
     </w:p>
     <w:p>
@@ -4355,6 +4342,908 @@
         <w:t>如果关闭后仍有输出，在 Excel 的“问题记录”中登记为无法完全退出或残留后台进程。</w:t>
       </w:r>
     </w:p>
+    <w:p>
+      <w:r>
+        <w:br w:type="page"/>
+      </w:r>
+    </w:p>
+    <w:p>
+      <w:pPr>
+        <w:pStyle w:val="Heading1"/>
+      </w:pPr>
+      <w:r>
+        <w:rPr>
+          <w:rFonts w:ascii="Microsoft YaHei" w:hAnsi="Microsoft YaHei" w:eastAsia="Microsoft YaHei"/>
+          <w:b/>
+          <w:color w:val="1F4E5F"/>
+          <w:sz w:val="32"/>
+        </w:rPr>
+        <w:t>附录 C：最终测试产品清单</w:t>
+      </w:r>
+    </w:p>
+    <w:p>
+      <w:r>
+        <w:rPr>
+          <w:rFonts w:ascii="Microsoft YaHei" w:hAnsi="Microsoft YaHei" w:eastAsia="Microsoft YaHei"/>
+          <w:b w:val="0"/>
+          <w:sz w:val="21"/>
+        </w:rPr>
+        <w:t>以下是当前最终纳入性能评估的产品清单。除已验证进程名的产品外，其余产品必须在正式采集前先确认启动方式、主进程名和是否存在子进程/渲染进程。</w:t>
+      </w:r>
+    </w:p>
+    <w:tbl>
+      <w:tblPr>
+        <w:tblW w:type="auto" w:w="0"/>
+        <w:jc w:val="center"/>
+        <w:tblLayout w:type="fixed"/>
+        <w:tblLook w:firstColumn="1" w:firstRow="1" w:lastColumn="0" w:lastRow="0" w:noHBand="0" w:noVBand="1" w:val="04A0"/>
+      </w:tblPr>
+      <w:tblGrid>
+        <w:gridCol w:w="1080"/>
+        <w:gridCol w:w="2952"/>
+        <w:gridCol w:w="2592"/>
+        <w:gridCol w:w="1800"/>
+        <w:gridCol w:w="3096"/>
+      </w:tblGrid>
+      <w:tr>
+        <w:tc>
+          <w:tcPr>
+            <w:tcW w:type="dxa" w:w="1958"/>
+            <w:shd w:fill="1F4E5F"/>
+            <w:tcBorders>
+              <w:top w:val="single" w:sz="6" w:space="0" w:color="1F4E5F"/>
+              <w:left w:val="single" w:sz="6" w:space="0" w:color="1F4E5F"/>
+              <w:bottom w:val="single" w:sz="6" w:space="0" w:color="1F4E5F"/>
+              <w:right w:val="single" w:sz="6" w:space="0" w:color="1F4E5F"/>
+            </w:tcBorders>
+            <w:vAlign w:val="center"/>
+          </w:tcPr>
+          <w:p>
+            <w:r>
+              <w:rPr>
+                <w:rFonts w:ascii="Microsoft YaHei" w:hAnsi="Microsoft YaHei" w:eastAsia="Microsoft YaHei"/>
+                <w:b/>
+                <w:color w:val="FFFFFF"/>
+                <w:sz w:val="18"/>
+              </w:rPr>
+              <w:t>产品ID</w:t>
+            </w:r>
+          </w:p>
+        </w:tc>
+        <w:tc>
+          <w:tcPr>
+            <w:tcW w:type="dxa" w:w="1958"/>
+            <w:shd w:fill="1F4E5F"/>
+            <w:tcBorders>
+              <w:top w:val="single" w:sz="6" w:space="0" w:color="1F4E5F"/>
+              <w:left w:val="single" w:sz="6" w:space="0" w:color="1F4E5F"/>
+              <w:bottom w:val="single" w:sz="6" w:space="0" w:color="1F4E5F"/>
+              <w:right w:val="single" w:sz="6" w:space="0" w:color="1F4E5F"/>
+            </w:tcBorders>
+            <w:vAlign w:val="center"/>
+          </w:tcPr>
+          <w:p>
+            <w:r>
+              <w:rPr>
+                <w:rFonts w:ascii="Microsoft YaHei" w:hAnsi="Microsoft YaHei" w:eastAsia="Microsoft YaHei"/>
+                <w:b/>
+                <w:color w:val="FFFFFF"/>
+                <w:sz w:val="18"/>
+              </w:rPr>
+              <w:t>产品名称</w:t>
+            </w:r>
+          </w:p>
+        </w:tc>
+        <w:tc>
+          <w:tcPr>
+            <w:tcW w:type="dxa" w:w="1958"/>
+            <w:shd w:fill="1F4E5F"/>
+            <w:tcBorders>
+              <w:top w:val="single" w:sz="6" w:space="0" w:color="1F4E5F"/>
+              <w:left w:val="single" w:sz="6" w:space="0" w:color="1F4E5F"/>
+              <w:bottom w:val="single" w:sz="6" w:space="0" w:color="1F4E5F"/>
+              <w:right w:val="single" w:sz="6" w:space="0" w:color="1F4E5F"/>
+            </w:tcBorders>
+            <w:vAlign w:val="center"/>
+          </w:tcPr>
+          <w:p>
+            <w:r>
+              <w:rPr>
+                <w:rFonts w:ascii="Microsoft YaHei" w:hAnsi="Microsoft YaHei" w:eastAsia="Microsoft YaHei"/>
+                <w:b/>
+                <w:color w:val="FFFFFF"/>
+                <w:sz w:val="18"/>
+              </w:rPr>
+              <w:t>来源/启动</w:t>
+            </w:r>
+          </w:p>
+        </w:tc>
+        <w:tc>
+          <w:tcPr>
+            <w:tcW w:type="dxa" w:w="1958"/>
+            <w:shd w:fill="1F4E5F"/>
+            <w:tcBorders>
+              <w:top w:val="single" w:sz="6" w:space="0" w:color="1F4E5F"/>
+              <w:left w:val="single" w:sz="6" w:space="0" w:color="1F4E5F"/>
+              <w:bottom w:val="single" w:sz="6" w:space="0" w:color="1F4E5F"/>
+              <w:right w:val="single" w:sz="6" w:space="0" w:color="1F4E5F"/>
+            </w:tcBorders>
+            <w:vAlign w:val="center"/>
+          </w:tcPr>
+          <w:p>
+            <w:r>
+              <w:rPr>
+                <w:rFonts w:ascii="Microsoft YaHei" w:hAnsi="Microsoft YaHei" w:eastAsia="Microsoft YaHei"/>
+                <w:b/>
+                <w:color w:val="FFFFFF"/>
+                <w:sz w:val="18"/>
+              </w:rPr>
+              <w:t>主进程名</w:t>
+            </w:r>
+          </w:p>
+        </w:tc>
+        <w:tc>
+          <w:tcPr>
+            <w:tcW w:type="dxa" w:w="1958"/>
+            <w:shd w:fill="1F4E5F"/>
+            <w:tcBorders>
+              <w:top w:val="single" w:sz="6" w:space="0" w:color="1F4E5F"/>
+              <w:left w:val="single" w:sz="6" w:space="0" w:color="1F4E5F"/>
+              <w:bottom w:val="single" w:sz="6" w:space="0" w:color="1F4E5F"/>
+              <w:right w:val="single" w:sz="6" w:space="0" w:color="1F4E5F"/>
+            </w:tcBorders>
+            <w:vAlign w:val="center"/>
+          </w:tcPr>
+          <w:p>
+            <w:r>
+              <w:rPr>
+                <w:rFonts w:ascii="Microsoft YaHei" w:hAnsi="Microsoft YaHei" w:eastAsia="Microsoft YaHei"/>
+                <w:b/>
+                <w:color w:val="FFFFFF"/>
+                <w:sz w:val="18"/>
+              </w:rPr>
+              <w:t>测试备注</w:t>
+            </w:r>
+          </w:p>
+        </w:tc>
+      </w:tr>
+      <w:tr>
+        <w:tc>
+          <w:tcPr>
+            <w:tcW w:type="dxa" w:w="1080"/>
+          </w:tcPr>
+          <w:p>
+            <w:r>
+              <w:t>P001</w:t>
+            </w:r>
+          </w:p>
+        </w:tc>
+        <w:tc>
+          <w:tcPr>
+            <w:tcW w:type="dxa" w:w="2952"/>
+          </w:tcPr>
+          <w:p>
+            <w:r>
+              <w:t>BongoCat</w:t>
+            </w:r>
+          </w:p>
+        </w:tc>
+        <w:tc>
+          <w:tcPr>
+            <w:tcW w:type="dxa" w:w="2592"/>
+          </w:tcPr>
+          <w:p>
+            <w:r>
+              <w:t>GitHub Release/本地安装 / exe 直接运行</w:t>
+            </w:r>
+          </w:p>
+        </w:tc>
+        <w:tc>
+          <w:tcPr>
+            <w:tcW w:type="dxa" w:w="1800"/>
+          </w:tcPr>
+          <w:p>
+            <w:r>
+              <w:t>bongo-cat</w:t>
+            </w:r>
+          </w:p>
+        </w:tc>
+        <w:tc>
+          <w:tcPr>
+            <w:tcW w:type="dxa" w:w="3096"/>
+          </w:tcPr>
+          <w:p>
+            <w:r>
+              <w:t>路径：C:\Program Files\BongoCat\bongo-cat.exe；安装包 D:\desktop_pet\BongoCat\BongoCat_1.1.0_x64-setup.exe；源码包 D:\desktop_pet\BongoCat\BongoCat-master.zip；子进程/依赖：msedgewebview2；实际测试来源为 GitHub 下载的安装包；运行时确认：bongo-cat.exe；子进程 msedgewebview2.exe</w:t>
+            </w:r>
+          </w:p>
+        </w:tc>
+      </w:tr>
+      <w:tr>
+        <w:tc>
+          <w:tcPr>
+            <w:tcW w:type="dxa" w:w="1080"/>
+          </w:tcPr>
+          <w:p>
+            <w:r>
+              <w:t>P002</w:t>
+            </w:r>
+          </w:p>
+        </w:tc>
+        <w:tc>
+          <w:tcPr>
+            <w:tcW w:type="dxa" w:w="2952"/>
+          </w:tcPr>
+          <w:p>
+            <w:r>
+              <w:t>Desktop Mate</w:t>
+            </w:r>
+          </w:p>
+        </w:tc>
+        <w:tc>
+          <w:tcPr>
+            <w:tcW w:type="dxa" w:w="2592"/>
+          </w:tcPr>
+          <w:p>
+            <w:r>
+              <w:t>Steam / steam://rungameid/3301060</w:t>
+            </w:r>
+          </w:p>
+        </w:tc>
+        <w:tc>
+          <w:tcPr>
+            <w:tcW w:type="dxa" w:w="1800"/>
+          </w:tcPr>
+          <w:p>
+            <w:r>
+              <w:t>DesktopMate</w:t>
+            </w:r>
+          </w:p>
+        </w:tc>
+        <w:tc>
+          <w:tcPr>
+            <w:tcW w:type="dxa" w:w="3096"/>
+          </w:tcPr>
+          <w:p>
+            <w:r>
+              <w:t>路径：C:\Program Files (x86)\Steam\steamapps\common\Desktop Mate；子进程/依赖：未观察到固定子进程；运行时确认：DesktopMate.exe</w:t>
+            </w:r>
+          </w:p>
+        </w:tc>
+      </w:tr>
+      <w:tr>
+        <w:tc>
+          <w:tcPr>
+            <w:tcW w:type="dxa" w:w="1080"/>
+          </w:tcPr>
+          <w:p>
+            <w:r>
+              <w:t>P003</w:t>
+            </w:r>
+          </w:p>
+        </w:tc>
+        <w:tc>
+          <w:tcPr>
+            <w:tcW w:type="dxa" w:w="2952"/>
+          </w:tcPr>
+          <w:p>
+            <w:r>
+              <w:t>VPet-Simulator</w:t>
+            </w:r>
+          </w:p>
+        </w:tc>
+        <w:tc>
+          <w:tcPr>
+            <w:tcW w:type="dxa" w:w="2592"/>
+          </w:tcPr>
+          <w:p>
+            <w:r>
+              <w:t>Steam / steam://rungameid/1920960</w:t>
+            </w:r>
+          </w:p>
+        </w:tc>
+        <w:tc>
+          <w:tcPr>
+            <w:tcW w:type="dxa" w:w="1800"/>
+          </w:tcPr>
+          <w:p>
+            <w:r>
+              <w:t>VPet-Simulator.Windows</w:t>
+            </w:r>
+          </w:p>
+        </w:tc>
+        <w:tc>
+          <w:tcPr>
+            <w:tcW w:type="dxa" w:w="3096"/>
+          </w:tcPr>
+          <w:p>
+            <w:r>
+              <w:t>路径：C:\Program Files (x86)\Steam\steamapps\common\VPet；子进程/依赖：未观察到固定子进程；运行时确认：VPet-Simulator.Windows.exe</w:t>
+            </w:r>
+          </w:p>
+        </w:tc>
+      </w:tr>
+      <w:tr>
+        <w:tc>
+          <w:tcPr>
+            <w:tcW w:type="dxa" w:w="1080"/>
+          </w:tcPr>
+          <w:p>
+            <w:r>
+              <w:t>P004</w:t>
+            </w:r>
+          </w:p>
+        </w:tc>
+        <w:tc>
+          <w:tcPr>
+            <w:tcW w:type="dxa" w:w="2952"/>
+          </w:tcPr>
+          <w:p>
+            <w:r>
+              <w:t>Desktop Goose</w:t>
+            </w:r>
+          </w:p>
+        </w:tc>
+        <w:tc>
+          <w:tcPr>
+            <w:tcW w:type="dxa" w:w="2592"/>
+          </w:tcPr>
+          <w:p>
+            <w:r>
+              <w:t>itch.io / itch.io 安装包 / exe 直接运行</w:t>
+            </w:r>
+          </w:p>
+        </w:tc>
+        <w:tc>
+          <w:tcPr>
+            <w:tcW w:type="dxa" w:w="1800"/>
+          </w:tcPr>
+          <w:p>
+            <w:r>
+              <w:t>GooseDesktop</w:t>
+            </w:r>
+          </w:p>
+        </w:tc>
+        <w:tc>
+          <w:tcPr>
+            <w:tcW w:type="dxa" w:w="3096"/>
+          </w:tcPr>
+          <w:p>
+            <w:r>
+              <w:t>路径：C:\Users\zoeuuliu\Downloads\Desktop Goose v0.31\DesktopGoose v0.31\GooseDesktop.exe；来源页：https://samperson.itch.io/desktop-goose；下载包：C:\Users\zoeuuliu\Downloads\Desktop Goose v0.31.zip；子进程/依赖：未观察到固定子进程；运行时确认：GooseDesktop.exe</w:t>
+            </w:r>
+          </w:p>
+        </w:tc>
+      </w:tr>
+      <w:tr>
+        <w:tc>
+          <w:tcPr>
+            <w:tcW w:type="dxa" w:w="1080"/>
+          </w:tcPr>
+          <w:p>
+            <w:r>
+              <w:t>P005</w:t>
+            </w:r>
+          </w:p>
+        </w:tc>
+        <w:tc>
+          <w:tcPr>
+            <w:tcW w:type="dxa" w:w="2952"/>
+          </w:tcPr>
+          <w:p>
+            <w:r>
+              <w:t>Ai Vpet</w:t>
+            </w:r>
+          </w:p>
+        </w:tc>
+        <w:tc>
+          <w:tcPr>
+            <w:tcW w:type="dxa" w:w="2592"/>
+          </w:tcPr>
+          <w:p>
+            <w:r>
+              <w:t>Steam / steam://rungameid/3029820</w:t>
+            </w:r>
+          </w:p>
+        </w:tc>
+        <w:tc>
+          <w:tcPr>
+            <w:tcW w:type="dxa" w:w="1800"/>
+          </w:tcPr>
+          <w:p>
+            <w:r>
+              <w:t>Ai Vpet</w:t>
+            </w:r>
+          </w:p>
+        </w:tc>
+        <w:tc>
+          <w:tcPr>
+            <w:tcW w:type="dxa" w:w="3096"/>
+          </w:tcPr>
+          <w:p>
+            <w:r>
+              <w:t>路径：C:\Program Files (x86)\Steam\steamapps\common\Ai Vpet；子进程/依赖：UnityCrashHandler64；运行时确认：Ai Vpet.exe；子进程 UnityCrashHandler64.exe</w:t>
+            </w:r>
+          </w:p>
+        </w:tc>
+      </w:tr>
+      <w:tr>
+        <w:tc>
+          <w:tcPr>
+            <w:tcW w:type="dxa" w:w="1080"/>
+          </w:tcPr>
+          <w:p>
+            <w:r>
+              <w:t>P006</w:t>
+            </w:r>
+          </w:p>
+        </w:tc>
+        <w:tc>
+          <w:tcPr>
+            <w:tcW w:type="dxa" w:w="2952"/>
+          </w:tcPr>
+          <w:p>
+            <w:r>
+              <w:t>Tiny Pasture</w:t>
+            </w:r>
+          </w:p>
+        </w:tc>
+        <w:tc>
+          <w:tcPr>
+            <w:tcW w:type="dxa" w:w="2592"/>
+          </w:tcPr>
+          <w:p>
+            <w:r>
+              <w:t>Steam / steam://rungameid/3167550</w:t>
+            </w:r>
+          </w:p>
+        </w:tc>
+        <w:tc>
+          <w:tcPr>
+            <w:tcW w:type="dxa" w:w="1800"/>
+          </w:tcPr>
+          <w:p>
+            <w:r>
+              <w:t>TinyPasture</w:t>
+            </w:r>
+          </w:p>
+        </w:tc>
+        <w:tc>
+          <w:tcPr>
+            <w:tcW w:type="dxa" w:w="3096"/>
+          </w:tcPr>
+          <w:p>
+            <w:r>
+              <w:t>路径：C:\Program Files (x86)\Steam\steamapps\common\TinyPasture；子进程/依赖：未观察到固定子进程；运行时确认：TinyPasture.exe</w:t>
+            </w:r>
+          </w:p>
+        </w:tc>
+      </w:tr>
+      <w:tr>
+        <w:tc>
+          <w:tcPr>
+            <w:tcW w:type="dxa" w:w="1080"/>
+          </w:tcPr>
+          <w:p>
+            <w:r>
+              <w:t>P007</w:t>
+            </w:r>
+          </w:p>
+        </w:tc>
+        <w:tc>
+          <w:tcPr>
+            <w:tcW w:type="dxa" w:w="2952"/>
+          </w:tcPr>
+          <w:p>
+            <w:r>
+              <w:t>Pocket Waifu:Desktop Pet</w:t>
+            </w:r>
+          </w:p>
+        </w:tc>
+        <w:tc>
+          <w:tcPr>
+            <w:tcW w:type="dxa" w:w="2592"/>
+          </w:tcPr>
+          <w:p>
+            <w:r>
+              <w:t>Steam / steam://rungameid/2989820</w:t>
+            </w:r>
+          </w:p>
+        </w:tc>
+        <w:tc>
+          <w:tcPr>
+            <w:tcW w:type="dxa" w:w="1800"/>
+          </w:tcPr>
+          <w:p>
+            <w:r>
+              <w:t>PocketWaifu</w:t>
+            </w:r>
+          </w:p>
+        </w:tc>
+        <w:tc>
+          <w:tcPr>
+            <w:tcW w:type="dxa" w:w="3096"/>
+          </w:tcPr>
+          <w:p>
+            <w:r>
+              <w:t>路径：C:\Program Files (x86)\Steam\steamapps\common\Pocket Waifu Pet；子进程/依赖：UnityCrashHandler64；运行时确认：PocketWaifu.exe；子进程 UnityCrashHandler64.exe</w:t>
+            </w:r>
+          </w:p>
+        </w:tc>
+      </w:tr>
+      <w:tr>
+        <w:tc>
+          <w:tcPr>
+            <w:tcW w:type="dxa" w:w="1080"/>
+          </w:tcPr>
+          <w:p>
+            <w:r>
+              <w:t>P008</w:t>
+            </w:r>
+          </w:p>
+        </w:tc>
+        <w:tc>
+          <w:tcPr>
+            <w:tcW w:type="dxa" w:w="2952"/>
+          </w:tcPr>
+          <w:p>
+            <w:r>
+              <w:t>Rusty's Retirement</w:t>
+            </w:r>
+          </w:p>
+        </w:tc>
+        <w:tc>
+          <w:tcPr>
+            <w:tcW w:type="dxa" w:w="2592"/>
+          </w:tcPr>
+          <w:p>
+            <w:r>
+              <w:t>Steam / steam://rungameid/2666510</w:t>
+            </w:r>
+          </w:p>
+        </w:tc>
+        <w:tc>
+          <w:tcPr>
+            <w:tcW w:type="dxa" w:w="1800"/>
+          </w:tcPr>
+          <w:p>
+            <w:r>
+              <w:t>Rusty's Retirement</w:t>
+            </w:r>
+          </w:p>
+        </w:tc>
+        <w:tc>
+          <w:tcPr>
+            <w:tcW w:type="dxa" w:w="3096"/>
+          </w:tcPr>
+          <w:p>
+            <w:r>
+              <w:t>路径：C:\Program Files (x86)\Steam\steamapps\common\Rusty's Retirement；子进程/依赖：UnityCrashHandler64；运行时确认：Rusty's Retirement.exe；子进程 UnityCrashHandler64.exe</w:t>
+            </w:r>
+          </w:p>
+        </w:tc>
+      </w:tr>
+      <w:tr>
+        <w:tc>
+          <w:tcPr>
+            <w:tcW w:type="dxa" w:w="1080"/>
+          </w:tcPr>
+          <w:p>
+            <w:r>
+              <w:t>P009</w:t>
+            </w:r>
+          </w:p>
+        </w:tc>
+        <w:tc>
+          <w:tcPr>
+            <w:tcW w:type="dxa" w:w="2952"/>
+          </w:tcPr>
+          <w:p>
+            <w:r>
+              <w:t>MateEngine</w:t>
+            </w:r>
+          </w:p>
+        </w:tc>
+        <w:tc>
+          <w:tcPr>
+            <w:tcW w:type="dxa" w:w="2592"/>
+          </w:tcPr>
+          <w:p>
+            <w:r>
+              <w:t>Steam / steam://rungameid/3625270</w:t>
+            </w:r>
+          </w:p>
+        </w:tc>
+        <w:tc>
+          <w:tcPr>
+            <w:tcW w:type="dxa" w:w="1800"/>
+          </w:tcPr>
+          <w:p>
+            <w:r>
+              <w:t>MateEngineX</w:t>
+            </w:r>
+          </w:p>
+        </w:tc>
+        <w:tc>
+          <w:tcPr>
+            <w:tcW w:type="dxa" w:w="3096"/>
+          </w:tcPr>
+          <w:p>
+            <w:r>
+              <w:t>路径：C:\Program Files (x86)\Steam\steamapps\common\MateEngine；子进程/依赖：UnityCrashHandler64；运行时确认：MateEngineX.exe；子进程 UnityCrashHandler64.exe</w:t>
+            </w:r>
+          </w:p>
+        </w:tc>
+      </w:tr>
+      <w:tr>
+        <w:tc>
+          <w:tcPr>
+            <w:tcW w:type="dxa" w:w="1080"/>
+          </w:tcPr>
+          <w:p>
+            <w:r>
+              <w:t>P010</w:t>
+            </w:r>
+          </w:p>
+        </w:tc>
+        <w:tc>
+          <w:tcPr>
+            <w:tcW w:type="dxa" w:w="2952"/>
+          </w:tcPr>
+          <w:p>
+            <w:r>
+              <w:t>Ai桌面宠物</w:t>
+            </w:r>
+          </w:p>
+        </w:tc>
+        <w:tc>
+          <w:tcPr>
+            <w:tcW w:type="dxa" w:w="2592"/>
+          </w:tcPr>
+          <w:p>
+            <w:r>
+              <w:t>Steam / steam://rungameid/4227700</w:t>
+            </w:r>
+          </w:p>
+        </w:tc>
+        <w:tc>
+          <w:tcPr>
+            <w:tcW w:type="dxa" w:w="1800"/>
+          </w:tcPr>
+          <w:p>
+            <w:r>
+              <w:t>AIDesktopPet</w:t>
+            </w:r>
+          </w:p>
+        </w:tc>
+        <w:tc>
+          <w:tcPr>
+            <w:tcW w:type="dxa" w:w="3096"/>
+          </w:tcPr>
+          <w:p>
+            <w:r>
+              <w:t>路径：C:\Program Files (x86)\Steam\steamapps\common\AIDesktopPet；子进程/依赖：AIDesktopPet 多进程；AI 功能可能拉起 python/pythonw/ffmpeg/node；运行时确认：AIDesktopPet.exe 多进程</w:t>
+            </w:r>
+          </w:p>
+        </w:tc>
+      </w:tr>
+      <w:tr>
+        <w:tc>
+          <w:tcPr>
+            <w:tcW w:type="dxa" w:w="1080"/>
+          </w:tcPr>
+          <w:p>
+            <w:r>
+              <w:t>P011</w:t>
+            </w:r>
+          </w:p>
+        </w:tc>
+        <w:tc>
+          <w:tcPr>
+            <w:tcW w:type="dxa" w:w="2952"/>
+          </w:tcPr>
+          <w:p>
+            <w:r>
+              <w:t>角落里的艾果 Eggo</w:t>
+            </w:r>
+          </w:p>
+        </w:tc>
+        <w:tc>
+          <w:tcPr>
+            <w:tcW w:type="dxa" w:w="2592"/>
+          </w:tcPr>
+          <w:p>
+            <w:r>
+              <w:t>Steam / steam://rungameid/3700760</w:t>
+            </w:r>
+          </w:p>
+        </w:tc>
+        <w:tc>
+          <w:tcPr>
+            <w:tcW w:type="dxa" w:w="1800"/>
+          </w:tcPr>
+          <w:p>
+            <w:r>
+              <w:t>Eggo</w:t>
+            </w:r>
+          </w:p>
+        </w:tc>
+        <w:tc>
+          <w:tcPr>
+            <w:tcW w:type="dxa" w:w="3096"/>
+          </w:tcPr>
+          <w:p>
+            <w:r>
+              <w:t>路径：C:\Program Files (x86)\Steam\steamapps\common\Eggo；子进程/依赖：未观察到固定子进程；运行时确认：Eggo.exe</w:t>
+            </w:r>
+          </w:p>
+        </w:tc>
+      </w:tr>
+      <w:tr>
+        <w:tc>
+          <w:tcPr>
+            <w:tcW w:type="dxa" w:w="1080"/>
+          </w:tcPr>
+          <w:p>
+            <w:r>
+              <w:t>P012</w:t>
+            </w:r>
+          </w:p>
+        </w:tc>
+        <w:tc>
+          <w:tcPr>
+            <w:tcW w:type="dxa" w:w="2952"/>
+          </w:tcPr>
+          <w:p>
+            <w:r>
+              <w:t>Molili Ai Friends: Ai 桌面宠物</w:t>
+            </w:r>
+          </w:p>
+        </w:tc>
+        <w:tc>
+          <w:tcPr>
+            <w:tcW w:type="dxa" w:w="2592"/>
+          </w:tcPr>
+          <w:p>
+            <w:r>
+              <w:t>Steam / steam://rungameid/4141770</w:t>
+            </w:r>
+          </w:p>
+        </w:tc>
+        <w:tc>
+          <w:tcPr>
+            <w:tcW w:type="dxa" w:w="1800"/>
+          </w:tcPr>
+          <w:p>
+            <w:r>
+              <w:t>Molili</w:t>
+            </w:r>
+          </w:p>
+        </w:tc>
+        <w:tc>
+          <w:tcPr>
+            <w:tcW w:type="dxa" w:w="3096"/>
+          </w:tcPr>
+          <w:p>
+            <w:r>
+              <w:t>路径：C:\Program Files (x86)\Steam\steamapps\common\Molili；子进程/依赖：msedgewebview2；运行时确认：Molili.exe；子进程 msedgewebview2.exe</w:t>
+            </w:r>
+          </w:p>
+        </w:tc>
+      </w:tr>
+      <w:tr>
+        <w:tc>
+          <w:tcPr>
+            <w:tcW w:type="dxa" w:w="1080"/>
+          </w:tcPr>
+          <w:p>
+            <w:r>
+              <w:t>P013</w:t>
+            </w:r>
+          </w:p>
+        </w:tc>
+        <w:tc>
+          <w:tcPr>
+            <w:tcW w:type="dxa" w:w="2952"/>
+          </w:tcPr>
+          <w:p>
+            <w:r>
+              <w:t>猫娘计划 - N.E.K.O</w:t>
+            </w:r>
+          </w:p>
+        </w:tc>
+        <w:tc>
+          <w:tcPr>
+            <w:tcW w:type="dxa" w:w="2592"/>
+          </w:tcPr>
+          <w:p>
+            <w:r>
+              <w:t>Steam / steam://rungameid/4099310</w:t>
+            </w:r>
+          </w:p>
+        </w:tc>
+        <w:tc>
+          <w:tcPr>
+            <w:tcW w:type="dxa" w:w="1800"/>
+          </w:tcPr>
+          <w:p>
+            <w:r>
+              <w:t>N.E.K.O</w:t>
+            </w:r>
+          </w:p>
+        </w:tc>
+        <w:tc>
+          <w:tcPr>
+            <w:tcW w:type="dxa" w:w="3096"/>
+          </w:tcPr>
+          <w:p>
+            <w:r>
+              <w:t>路径：C:\Program Files (x86)\Steam\steamapps\common\n.e.k.o；子进程/依赖：N.E.K.O 多进程；projectneko_server/openfang；运行时确认：N.E.K.O.exe 多进程；子进程 projectneko_server.exe、openfang.exe</w:t>
+            </w:r>
+          </w:p>
+        </w:tc>
+      </w:tr>
+    </w:tbl>
+    <w:p>
+      <w:pPr>
+        <w:pStyle w:val="Heading2"/>
+      </w:pPr>
+      <w:r>
+        <w:t>C1. 正式测试前必须完成的进程校验</w:t>
+      </w:r>
+    </w:p>
+    <w:p>
+      <w:pPr>
+        <w:pStyle w:val="ListBullet"/>
+      </w:pPr>
+      <w:r>
+        <w:rPr>
+          <w:rFonts w:ascii="Microsoft YaHei" w:hAnsi="Microsoft YaHei" w:eastAsia="Microsoft YaHei"/>
+          <w:b w:val="0"/>
+          <w:sz w:val="21"/>
+        </w:rPr>
+        <w:t>启动产品后，用 Get-Process 或任务管理器确认主进程名。</w:t>
+      </w:r>
+    </w:p>
+    <w:p>
+      <w:pPr>
+        <w:pStyle w:val="ListBullet"/>
+      </w:pPr>
+      <w:r>
+        <w:rPr>
+          <w:rFonts w:ascii="Microsoft YaHei" w:hAnsi="Microsoft YaHei" w:eastAsia="Microsoft YaHei"/>
+          <w:b w:val="0"/>
+          <w:sz w:val="21"/>
+        </w:rPr>
+        <w:t>如果产品基于 Electron、Tauri、WebView2、Unity 启动器或浏览器前端，必须把子进程树纳入统计。</w:t>
+      </w:r>
+    </w:p>
+    <w:p>
+      <w:pPr>
+        <w:pStyle w:val="ListBullet"/>
+      </w:pPr>
+      <w:r>
+        <w:rPr>
+          <w:rFonts w:ascii="Microsoft YaHei" w:hAnsi="Microsoft YaHei" w:eastAsia="Microsoft YaHei"/>
+          <w:b w:val="0"/>
+          <w:sz w:val="21"/>
+        </w:rPr>
+        <w:t>采集脚本输出中 process_found_rate 必须为 100%，process_count 不能为 0。</w:t>
+      </w:r>
+    </w:p>
+    <w:p>
+      <w:pPr>
+        <w:pStyle w:val="ListBullet"/>
+      </w:pPr>
+      <w:r>
+        <w:rPr>
+          <w:rFonts w:ascii="Microsoft YaHei" w:hAnsi="Microsoft YaHei" w:eastAsia="Microsoft YaHei"/>
+          <w:b w:val="0"/>
+          <w:sz w:val="21"/>
+        </w:rPr>
+        <w:t>如果 CPU/GPU/内存全部为 0，数据直接判定无效，不写入正式结论。</w:t>
+      </w:r>
+    </w:p>
     <w:sectPr>
       <w:pgSz w:w="12240" w:h="15840"/>
       <w:pgMar w:top="1080" w:right="1224" w:bottom="1080" w:left="1224" w:header="720" w:footer="720" w:gutter="0"/>

</xml_diff>